<commit_message>
Thesis: align modules and test documents with Chapter 3 module codes (U, D, L, E)
Co-Authored-By: Claude Opus 5.5 <noreply@anthropic.com>
Claude-Session: https://claude.ai/code/session_01THqB2neCikVAawL45RNVrt
</commit_message>
<xml_diff>
--- a/docs/thesis/testing/3 - AgentMeter Accuracy Testing.docx
+++ b/docs/thesis/testing/3 - AgentMeter Accuracy Testing.docx
@@ -27,7 +27,7 @@
           <w:i w:val="0"/>
           <w:sz w:val="24"/>
         </w:rPr>
-        <w:t>Accuracy testing checks that the values AgentMeter prepares, measures and calculates are correct. A fixed set of test datasets (Table 3.31) is prepared and benchmarked on the GPU server. Each value is then worked out by hand, in a spreadsheet or with an independent tool, using the formula or method given, from the session's own raw per-flow results, and compared with the value the system displays. A result is accepted as accurate when the difference is within the tolerance in Table 3.30.</w:t>
+        <w:t>Accuracy testing checks that the values AgentMeter prepares, measures and calculates are correct. A fixed set of test datasets (Table 3.33) is prepared and benchmarked on the GPU server. Each value is then worked out by hand, in a spreadsheet or with an independent tool, using the formula or method given, from the session's own raw per-flow results, and compared with the value the system displays. A result is accepted as accurate when the difference is within the tolerance in Table 3.32.</w:t>
       </w:r>
     </w:p>
     <w:p>
@@ -55,7 +55,7 @@
           <w:i w:val="0"/>
           <w:sz w:val="24"/>
         </w:rPr>
-        <w:t>Table 3.30: Test Environment and Accuracy Criteria</w:t>
+        <w:t>Table 3.32: Test Environment and Accuracy Criteria</w:t>
       </w:r>
     </w:p>
     <w:tbl>
@@ -530,7 +530,7 @@
           <w:i w:val="0"/>
           <w:sz w:val="24"/>
         </w:rPr>
-        <w:t>Table 3.31: Test Dataset</w:t>
+        <w:t>Table 3.33: Test Dataset</w:t>
       </w:r>
     </w:p>
     <w:p>
@@ -1633,7 +1633,7 @@
           <w:i w:val="0"/>
           <w:sz w:val="24"/>
         </w:rPr>
-        <w:t>Table 3.32: Data Preparation Accuracy</w:t>
+        <w:t>Table 3.34: Data Preparation Accuracy</w:t>
       </w:r>
     </w:p>
     <w:tbl>
@@ -3110,7 +3110,7 @@
           <w:i w:val="0"/>
           <w:sz w:val="24"/>
         </w:rPr>
-        <w:t>Table 3.33: Classification Output Mapping Accuracy</w:t>
+        <w:t>Table 3.35: Classification Output Mapping Accuracy</w:t>
       </w:r>
     </w:p>
     <w:p>
@@ -4217,7 +4217,7 @@
           <w:i w:val="0"/>
           <w:sz w:val="24"/>
         </w:rPr>
-        <w:t>Table 3.34: Per-Agent Measurement Accuracy</w:t>
+        <w:t>Table 3.36: Per-Agent Measurement Accuracy</w:t>
       </w:r>
     </w:p>
     <w:p>
@@ -5426,7 +5426,7 @@
           <w:i w:val="0"/>
           <w:sz w:val="24"/>
         </w:rPr>
-        <w:t>Table 3.35: Energy and Cost Accuracy</w:t>
+        <w:t>Table 3.37: Energy and Cost Accuracy</w:t>
       </w:r>
     </w:p>
     <w:p>
@@ -6282,7 +6282,7 @@
           <w:i w:val="0"/>
           <w:sz w:val="24"/>
         </w:rPr>
-        <w:t>Table 3.36: Scoring Accuracy</w:t>
+        <w:t>Table 3.38: Scoring Accuracy</w:t>
       </w:r>
     </w:p>
     <w:p>
@@ -7477,7 +7477,7 @@
           <w:i w:val="0"/>
           <w:sz w:val="24"/>
         </w:rPr>
-        <w:t>Table 3.37: Statistical Test Accuracy</w:t>
+        <w:t>Table 3.39: Statistical Test Accuracy</w:t>
       </w:r>
     </w:p>
     <w:p>
@@ -8333,7 +8333,7 @@
           <w:i w:val="0"/>
           <w:sz w:val="24"/>
         </w:rPr>
-        <w:t>Table 3.38: Accuracy Testing Summary</w:t>
+        <w:t>Table 3.40: Accuracy Testing Summary</w:t>
       </w:r>
     </w:p>
     <w:tbl>
@@ -8352,10 +8352,11 @@
         <w:tblW w:w="8306" w:type="dxa"/>
       </w:tblPr>
       <w:tblGrid>
-        <w:gridCol w:w="3534"/>
-        <w:gridCol w:w="1591"/>
-        <w:gridCol w:w="1591"/>
-        <w:gridCol w:w="1591"/>
+        <w:gridCol w:w="2828"/>
+        <w:gridCol w:w="1502"/>
+        <w:gridCol w:w="1325"/>
+        <w:gridCol w:w="1325"/>
+        <w:gridCol w:w="1325"/>
       </w:tblGrid>
       <w:tr>
         <w:trPr>
@@ -8363,7 +8364,7 @@
         </w:trPr>
         <w:tc>
           <w:tcPr>
-            <w:tcW w:type="dxa" w:w="3534"/>
+            <w:tcW w:type="dxa" w:w="2828"/>
             <w:shd w:val="clear" w:color="auto" w:fill="D9D9D9"/>
           </w:tcPr>
           <w:p>
@@ -8383,7 +8384,7 @@
         </w:tc>
         <w:tc>
           <w:tcPr>
-            <w:tcW w:type="dxa" w:w="1591"/>
+            <w:tcW w:type="dxa" w:w="1502"/>
             <w:shd w:val="clear" w:color="auto" w:fill="D9D9D9"/>
           </w:tcPr>
           <w:p>
@@ -8397,13 +8398,33 @@
                 <w:i w:val="0"/>
                 <w:sz w:val="24"/>
               </w:rPr>
+              <w:t>Modules Tested</w:t>
+            </w:r>
+          </w:p>
+        </w:tc>
+        <w:tc>
+          <w:tcPr>
+            <w:tcW w:type="dxa" w:w="1325"/>
+            <w:shd w:val="clear" w:color="auto" w:fill="D9D9D9"/>
+          </w:tcPr>
+          <w:p>
+            <w:pPr>
+              <w:spacing w:after="0" w:line="264" w:lineRule="auto"/>
+            </w:pPr>
+            <w:r>
+              <w:rPr>
+                <w:rFonts w:ascii="Times New Roman" w:hAnsi="Times New Roman" w:eastAsia="Times New Roman"/>
+                <w:b/>
+                <w:i w:val="0"/>
+                <w:sz w:val="24"/>
+              </w:rPr>
               <w:t>Number of Tests</w:t>
             </w:r>
           </w:p>
         </w:tc>
         <w:tc>
           <w:tcPr>
-            <w:tcW w:type="dxa" w:w="1591"/>
+            <w:tcW w:type="dxa" w:w="1325"/>
             <w:shd w:val="clear" w:color="auto" w:fill="D9D9D9"/>
           </w:tcPr>
           <w:p>
@@ -8423,7 +8444,7 @@
         </w:tc>
         <w:tc>
           <w:tcPr>
-            <w:tcW w:type="dxa" w:w="1591"/>
+            <w:tcW w:type="dxa" w:w="1325"/>
             <w:shd w:val="clear" w:color="auto" w:fill="D9D9D9"/>
           </w:tcPr>
           <w:p>
@@ -8445,7 +8466,7 @@
       <w:tr>
         <w:tc>
           <w:tcPr>
-            <w:tcW w:type="dxa" w:w="3534"/>
+            <w:tcW w:type="dxa" w:w="2828"/>
           </w:tcPr>
           <w:p>
             <w:pPr>
@@ -8464,7 +8485,26 @@
         </w:tc>
         <w:tc>
           <w:tcPr>
-            <w:tcW w:type="dxa" w:w="1591"/>
+            <w:tcW w:type="dxa" w:w="1502"/>
+          </w:tcPr>
+          <w:p>
+            <w:pPr>
+              <w:spacing w:after="0" w:line="264" w:lineRule="auto"/>
+            </w:pPr>
+            <w:r>
+              <w:rPr>
+                <w:rFonts w:ascii="Times New Roman" w:hAnsi="Times New Roman" w:eastAsia="Times New Roman"/>
+                <w:b w:val="0"/>
+                <w:i w:val="0"/>
+                <w:sz w:val="24"/>
+              </w:rPr>
+              <w:t>D01–D06</w:t>
+            </w:r>
+          </w:p>
+        </w:tc>
+        <w:tc>
+          <w:tcPr>
+            <w:tcW w:type="dxa" w:w="1325"/>
           </w:tcPr>
           <w:p>
             <w:pPr>
@@ -8483,25 +8523,25 @@
         </w:tc>
         <w:tc>
           <w:tcPr>
-            <w:tcW w:type="dxa" w:w="1591"/>
-          </w:tcPr>
-          <w:p>
-            <w:pPr>
-              <w:spacing w:after="0" w:line="264" w:lineRule="auto"/>
-            </w:pPr>
-            <w:r>
-              <w:rPr>
-                <w:rFonts w:ascii="Times New Roman" w:hAnsi="Times New Roman" w:eastAsia="Times New Roman"/>
-                <w:b w:val="0"/>
-                <w:i w:val="0"/>
-                <w:sz w:val="24"/>
-              </w:rPr>
-            </w:r>
-          </w:p>
-        </w:tc>
-        <w:tc>
-          <w:tcPr>
-            <w:tcW w:type="dxa" w:w="1591"/>
+            <w:tcW w:type="dxa" w:w="1325"/>
+          </w:tcPr>
+          <w:p>
+            <w:pPr>
+              <w:spacing w:after="0" w:line="264" w:lineRule="auto"/>
+            </w:pPr>
+            <w:r>
+              <w:rPr>
+                <w:rFonts w:ascii="Times New Roman" w:hAnsi="Times New Roman" w:eastAsia="Times New Roman"/>
+                <w:b w:val="0"/>
+                <w:i w:val="0"/>
+                <w:sz w:val="24"/>
+              </w:rPr>
+            </w:r>
+          </w:p>
+        </w:tc>
+        <w:tc>
+          <w:tcPr>
+            <w:tcW w:type="dxa" w:w="1325"/>
           </w:tcPr>
           <w:p>
             <w:pPr>
@@ -8521,7 +8561,7 @@
       <w:tr>
         <w:tc>
           <w:tcPr>
-            <w:tcW w:type="dxa" w:w="3534"/>
+            <w:tcW w:type="dxa" w:w="2828"/>
           </w:tcPr>
           <w:p>
             <w:pPr>
@@ -8540,7 +8580,26 @@
         </w:tc>
         <w:tc>
           <w:tcPr>
-            <w:tcW w:type="dxa" w:w="1591"/>
+            <w:tcW w:type="dxa" w:w="1502"/>
+          </w:tcPr>
+          <w:p>
+            <w:pPr>
+              <w:spacing w:after="0" w:line="264" w:lineRule="auto"/>
+            </w:pPr>
+            <w:r>
+              <w:rPr>
+                <w:rFonts w:ascii="Times New Roman" w:hAnsi="Times New Roman" w:eastAsia="Times New Roman"/>
+                <w:b w:val="0"/>
+                <w:i w:val="0"/>
+                <w:sz w:val="24"/>
+              </w:rPr>
+              <w:t>L04, E02</w:t>
+            </w:r>
+          </w:p>
+        </w:tc>
+        <w:tc>
+          <w:tcPr>
+            <w:tcW w:type="dxa" w:w="1325"/>
           </w:tcPr>
           <w:p>
             <w:pPr>
@@ -8559,25 +8618,25 @@
         </w:tc>
         <w:tc>
           <w:tcPr>
-            <w:tcW w:type="dxa" w:w="1591"/>
-          </w:tcPr>
-          <w:p>
-            <w:pPr>
-              <w:spacing w:after="0" w:line="264" w:lineRule="auto"/>
-            </w:pPr>
-            <w:r>
-              <w:rPr>
-                <w:rFonts w:ascii="Times New Roman" w:hAnsi="Times New Roman" w:eastAsia="Times New Roman"/>
-                <w:b w:val="0"/>
-                <w:i w:val="0"/>
-                <w:sz w:val="24"/>
-              </w:rPr>
-            </w:r>
-          </w:p>
-        </w:tc>
-        <w:tc>
-          <w:tcPr>
-            <w:tcW w:type="dxa" w:w="1591"/>
+            <w:tcW w:type="dxa" w:w="1325"/>
+          </w:tcPr>
+          <w:p>
+            <w:pPr>
+              <w:spacing w:after="0" w:line="264" w:lineRule="auto"/>
+            </w:pPr>
+            <w:r>
+              <w:rPr>
+                <w:rFonts w:ascii="Times New Roman" w:hAnsi="Times New Roman" w:eastAsia="Times New Roman"/>
+                <w:b w:val="0"/>
+                <w:i w:val="0"/>
+                <w:sz w:val="24"/>
+              </w:rPr>
+            </w:r>
+          </w:p>
+        </w:tc>
+        <w:tc>
+          <w:tcPr>
+            <w:tcW w:type="dxa" w:w="1325"/>
           </w:tcPr>
           <w:p>
             <w:pPr>
@@ -8597,7 +8656,7 @@
       <w:tr>
         <w:tc>
           <w:tcPr>
-            <w:tcW w:type="dxa" w:w="3534"/>
+            <w:tcW w:type="dxa" w:w="2828"/>
           </w:tcPr>
           <w:p>
             <w:pPr>
@@ -8616,7 +8675,26 @@
         </w:tc>
         <w:tc>
           <w:tcPr>
-            <w:tcW w:type="dxa" w:w="1591"/>
+            <w:tcW w:type="dxa" w:w="1502"/>
+          </w:tcPr>
+          <w:p>
+            <w:pPr>
+              <w:spacing w:after="0" w:line="264" w:lineRule="auto"/>
+            </w:pPr>
+            <w:r>
+              <w:rPr>
+                <w:rFonts w:ascii="Times New Roman" w:hAnsi="Times New Roman" w:eastAsia="Times New Roman"/>
+                <w:b w:val="0"/>
+                <w:i w:val="0"/>
+                <w:sz w:val="24"/>
+              </w:rPr>
+              <w:t>L05</w:t>
+            </w:r>
+          </w:p>
+        </w:tc>
+        <w:tc>
+          <w:tcPr>
+            <w:tcW w:type="dxa" w:w="1325"/>
           </w:tcPr>
           <w:p>
             <w:pPr>
@@ -8635,25 +8713,25 @@
         </w:tc>
         <w:tc>
           <w:tcPr>
-            <w:tcW w:type="dxa" w:w="1591"/>
-          </w:tcPr>
-          <w:p>
-            <w:pPr>
-              <w:spacing w:after="0" w:line="264" w:lineRule="auto"/>
-            </w:pPr>
-            <w:r>
-              <w:rPr>
-                <w:rFonts w:ascii="Times New Roman" w:hAnsi="Times New Roman" w:eastAsia="Times New Roman"/>
-                <w:b w:val="0"/>
-                <w:i w:val="0"/>
-                <w:sz w:val="24"/>
-              </w:rPr>
-            </w:r>
-          </w:p>
-        </w:tc>
-        <w:tc>
-          <w:tcPr>
-            <w:tcW w:type="dxa" w:w="1591"/>
+            <w:tcW w:type="dxa" w:w="1325"/>
+          </w:tcPr>
+          <w:p>
+            <w:pPr>
+              <w:spacing w:after="0" w:line="264" w:lineRule="auto"/>
+            </w:pPr>
+            <w:r>
+              <w:rPr>
+                <w:rFonts w:ascii="Times New Roman" w:hAnsi="Times New Roman" w:eastAsia="Times New Roman"/>
+                <w:b w:val="0"/>
+                <w:i w:val="0"/>
+                <w:sz w:val="24"/>
+              </w:rPr>
+            </w:r>
+          </w:p>
+        </w:tc>
+        <w:tc>
+          <w:tcPr>
+            <w:tcW w:type="dxa" w:w="1325"/>
           </w:tcPr>
           <w:p>
             <w:pPr>
@@ -8673,7 +8751,7 @@
       <w:tr>
         <w:tc>
           <w:tcPr>
-            <w:tcW w:type="dxa" w:w="3534"/>
+            <w:tcW w:type="dxa" w:w="2828"/>
           </w:tcPr>
           <w:p>
             <w:pPr>
@@ -8692,7 +8770,26 @@
         </w:tc>
         <w:tc>
           <w:tcPr>
-            <w:tcW w:type="dxa" w:w="1591"/>
+            <w:tcW w:type="dxa" w:w="1502"/>
+          </w:tcPr>
+          <w:p>
+            <w:pPr>
+              <w:spacing w:after="0" w:line="264" w:lineRule="auto"/>
+            </w:pPr>
+            <w:r>
+              <w:rPr>
+                <w:rFonts w:ascii="Times New Roman" w:hAnsi="Times New Roman" w:eastAsia="Times New Roman"/>
+                <w:b w:val="0"/>
+                <w:i w:val="0"/>
+                <w:sz w:val="24"/>
+              </w:rPr>
+              <w:t>E01, E05</w:t>
+            </w:r>
+          </w:p>
+        </w:tc>
+        <w:tc>
+          <w:tcPr>
+            <w:tcW w:type="dxa" w:w="1325"/>
           </w:tcPr>
           <w:p>
             <w:pPr>
@@ -8711,25 +8808,25 @@
         </w:tc>
         <w:tc>
           <w:tcPr>
-            <w:tcW w:type="dxa" w:w="1591"/>
-          </w:tcPr>
-          <w:p>
-            <w:pPr>
-              <w:spacing w:after="0" w:line="264" w:lineRule="auto"/>
-            </w:pPr>
-            <w:r>
-              <w:rPr>
-                <w:rFonts w:ascii="Times New Roman" w:hAnsi="Times New Roman" w:eastAsia="Times New Roman"/>
-                <w:b w:val="0"/>
-                <w:i w:val="0"/>
-                <w:sz w:val="24"/>
-              </w:rPr>
-            </w:r>
-          </w:p>
-        </w:tc>
-        <w:tc>
-          <w:tcPr>
-            <w:tcW w:type="dxa" w:w="1591"/>
+            <w:tcW w:type="dxa" w:w="1325"/>
+          </w:tcPr>
+          <w:p>
+            <w:pPr>
+              <w:spacing w:after="0" w:line="264" w:lineRule="auto"/>
+            </w:pPr>
+            <w:r>
+              <w:rPr>
+                <w:rFonts w:ascii="Times New Roman" w:hAnsi="Times New Roman" w:eastAsia="Times New Roman"/>
+                <w:b w:val="0"/>
+                <w:i w:val="0"/>
+                <w:sz w:val="24"/>
+              </w:rPr>
+            </w:r>
+          </w:p>
+        </w:tc>
+        <w:tc>
+          <w:tcPr>
+            <w:tcW w:type="dxa" w:w="1325"/>
           </w:tcPr>
           <w:p>
             <w:pPr>
@@ -8749,7 +8846,7 @@
       <w:tr>
         <w:tc>
           <w:tcPr>
-            <w:tcW w:type="dxa" w:w="3534"/>
+            <w:tcW w:type="dxa" w:w="2828"/>
           </w:tcPr>
           <w:p>
             <w:pPr>
@@ -8768,7 +8865,26 @@
         </w:tc>
         <w:tc>
           <w:tcPr>
-            <w:tcW w:type="dxa" w:w="1591"/>
+            <w:tcW w:type="dxa" w:w="1502"/>
+          </w:tcPr>
+          <w:p>
+            <w:pPr>
+              <w:spacing w:after="0" w:line="264" w:lineRule="auto"/>
+            </w:pPr>
+            <w:r>
+              <w:rPr>
+                <w:rFonts w:ascii="Times New Roman" w:hAnsi="Times New Roman" w:eastAsia="Times New Roman"/>
+                <w:b w:val="0"/>
+                <w:i w:val="0"/>
+                <w:sz w:val="24"/>
+              </w:rPr>
+              <w:t>E02, E03, E04</w:t>
+            </w:r>
+          </w:p>
+        </w:tc>
+        <w:tc>
+          <w:tcPr>
+            <w:tcW w:type="dxa" w:w="1325"/>
           </w:tcPr>
           <w:p>
             <w:pPr>
@@ -8787,25 +8903,25 @@
         </w:tc>
         <w:tc>
           <w:tcPr>
-            <w:tcW w:type="dxa" w:w="1591"/>
-          </w:tcPr>
-          <w:p>
-            <w:pPr>
-              <w:spacing w:after="0" w:line="264" w:lineRule="auto"/>
-            </w:pPr>
-            <w:r>
-              <w:rPr>
-                <w:rFonts w:ascii="Times New Roman" w:hAnsi="Times New Roman" w:eastAsia="Times New Roman"/>
-                <w:b w:val="0"/>
-                <w:i w:val="0"/>
-                <w:sz w:val="24"/>
-              </w:rPr>
-            </w:r>
-          </w:p>
-        </w:tc>
-        <w:tc>
-          <w:tcPr>
-            <w:tcW w:type="dxa" w:w="1591"/>
+            <w:tcW w:type="dxa" w:w="1325"/>
+          </w:tcPr>
+          <w:p>
+            <w:pPr>
+              <w:spacing w:after="0" w:line="264" w:lineRule="auto"/>
+            </w:pPr>
+            <w:r>
+              <w:rPr>
+                <w:rFonts w:ascii="Times New Roman" w:hAnsi="Times New Roman" w:eastAsia="Times New Roman"/>
+                <w:b w:val="0"/>
+                <w:i w:val="0"/>
+                <w:sz w:val="24"/>
+              </w:rPr>
+            </w:r>
+          </w:p>
+        </w:tc>
+        <w:tc>
+          <w:tcPr>
+            <w:tcW w:type="dxa" w:w="1325"/>
           </w:tcPr>
           <w:p>
             <w:pPr>
@@ -8825,7 +8941,7 @@
       <w:tr>
         <w:tc>
           <w:tcPr>
-            <w:tcW w:type="dxa" w:w="3534"/>
+            <w:tcW w:type="dxa" w:w="2828"/>
           </w:tcPr>
           <w:p>
             <w:pPr>
@@ -8844,7 +8960,26 @@
         </w:tc>
         <w:tc>
           <w:tcPr>
-            <w:tcW w:type="dxa" w:w="1591"/>
+            <w:tcW w:type="dxa" w:w="1502"/>
+          </w:tcPr>
+          <w:p>
+            <w:pPr>
+              <w:spacing w:after="0" w:line="264" w:lineRule="auto"/>
+            </w:pPr>
+            <w:r>
+              <w:rPr>
+                <w:rFonts w:ascii="Times New Roman" w:hAnsi="Times New Roman" w:eastAsia="Times New Roman"/>
+                <w:b w:val="0"/>
+                <w:i w:val="0"/>
+                <w:sz w:val="24"/>
+              </w:rPr>
+              <w:t>E06</w:t>
+            </w:r>
+          </w:p>
+        </w:tc>
+        <w:tc>
+          <w:tcPr>
+            <w:tcW w:type="dxa" w:w="1325"/>
           </w:tcPr>
           <w:p>
             <w:pPr>
@@ -8863,25 +8998,25 @@
         </w:tc>
         <w:tc>
           <w:tcPr>
-            <w:tcW w:type="dxa" w:w="1591"/>
-          </w:tcPr>
-          <w:p>
-            <w:pPr>
-              <w:spacing w:after="0" w:line="264" w:lineRule="auto"/>
-            </w:pPr>
-            <w:r>
-              <w:rPr>
-                <w:rFonts w:ascii="Times New Roman" w:hAnsi="Times New Roman" w:eastAsia="Times New Roman"/>
-                <w:b w:val="0"/>
-                <w:i w:val="0"/>
-                <w:sz w:val="24"/>
-              </w:rPr>
-            </w:r>
-          </w:p>
-        </w:tc>
-        <w:tc>
-          <w:tcPr>
-            <w:tcW w:type="dxa" w:w="1591"/>
+            <w:tcW w:type="dxa" w:w="1325"/>
+          </w:tcPr>
+          <w:p>
+            <w:pPr>
+              <w:spacing w:after="0" w:line="264" w:lineRule="auto"/>
+            </w:pPr>
+            <w:r>
+              <w:rPr>
+                <w:rFonts w:ascii="Times New Roman" w:hAnsi="Times New Roman" w:eastAsia="Times New Roman"/>
+                <w:b w:val="0"/>
+                <w:i w:val="0"/>
+                <w:sz w:val="24"/>
+              </w:rPr>
+            </w:r>
+          </w:p>
+        </w:tc>
+        <w:tc>
+          <w:tcPr>
+            <w:tcW w:type="dxa" w:w="1325"/>
           </w:tcPr>
           <w:p>
             <w:pPr>
@@ -8901,7 +9036,7 @@
       <w:tr>
         <w:tc>
           <w:tcPr>
-            <w:tcW w:type="dxa" w:w="3534"/>
+            <w:tcW w:type="dxa" w:w="2828"/>
           </w:tcPr>
           <w:p>
             <w:pPr>
@@ -8920,7 +9055,25 @@
         </w:tc>
         <w:tc>
           <w:tcPr>
-            <w:tcW w:type="dxa" w:w="1591"/>
+            <w:tcW w:type="dxa" w:w="1502"/>
+          </w:tcPr>
+          <w:p>
+            <w:pPr>
+              <w:spacing w:after="0" w:line="264" w:lineRule="auto"/>
+            </w:pPr>
+            <w:r>
+              <w:rPr>
+                <w:rFonts w:ascii="Times New Roman" w:hAnsi="Times New Roman" w:eastAsia="Times New Roman"/>
+                <w:b w:val="0"/>
+                <w:i w:val="0"/>
+                <w:sz w:val="24"/>
+              </w:rPr>
+            </w:r>
+          </w:p>
+        </w:tc>
+        <w:tc>
+          <w:tcPr>
+            <w:tcW w:type="dxa" w:w="1325"/>
           </w:tcPr>
           <w:p>
             <w:pPr>
@@ -8939,25 +9092,25 @@
         </w:tc>
         <w:tc>
           <w:tcPr>
-            <w:tcW w:type="dxa" w:w="1591"/>
-          </w:tcPr>
-          <w:p>
-            <w:pPr>
-              <w:spacing w:after="0" w:line="264" w:lineRule="auto"/>
-            </w:pPr>
-            <w:r>
-              <w:rPr>
-                <w:rFonts w:ascii="Times New Roman" w:hAnsi="Times New Roman" w:eastAsia="Times New Roman"/>
-                <w:b w:val="0"/>
-                <w:i w:val="0"/>
-                <w:sz w:val="24"/>
-              </w:rPr>
-            </w:r>
-          </w:p>
-        </w:tc>
-        <w:tc>
-          <w:tcPr>
-            <w:tcW w:type="dxa" w:w="1591"/>
+            <w:tcW w:type="dxa" w:w="1325"/>
+          </w:tcPr>
+          <w:p>
+            <w:pPr>
+              <w:spacing w:after="0" w:line="264" w:lineRule="auto"/>
+            </w:pPr>
+            <w:r>
+              <w:rPr>
+                <w:rFonts w:ascii="Times New Roman" w:hAnsi="Times New Roman" w:eastAsia="Times New Roman"/>
+                <w:b w:val="0"/>
+                <w:i w:val="0"/>
+                <w:sz w:val="24"/>
+              </w:rPr>
+            </w:r>
+          </w:p>
+        </w:tc>
+        <w:tc>
+          <w:tcPr>
+            <w:tcW w:type="dxa" w:w="1325"/>
           </w:tcPr>
           <w:p>
             <w:pPr>

</xml_diff>